<commit_message>
Clase 3: Función objetivo
</commit_message>
<xml_diff>
--- a/TecnicasDeIASemana1.docx
+++ b/TecnicasDeIASemana1.docx
@@ -235,46 +235,328 @@
         </w:rPr>
         <w:t xml:space="preserve"> </w:t>
       </w:r>
+      <w:r>
+        <w:rPr>
+          <w:sz w:val="24"/>
+          <w:szCs w:val="24"/>
+        </w:rPr>
+        <w:t>También durante la clase, el profesor hizo una dinámica de ofrecerles 7 y 8 en todo el semestre con la condición de no presentarse a su clase. Por esto, algunos compañeros decidieron retirarse al no querer comprometerse con el trabajo del semestre. Debido a esto, mis compañeros le pusieron como nombre a la clase “Selección natural”.</w:t>
+      </w:r>
+      <w:r>
+        <w:rPr>
+          <w:sz w:val="24"/>
+          <w:szCs w:val="24"/>
+        </w:rPr>
+        <w:t xml:space="preserve"> </w:t>
+      </w:r>
+      <w:r>
+        <w:rPr>
+          <w:sz w:val="24"/>
+          <w:szCs w:val="24"/>
+        </w:rPr>
+        <w:t>Finalmente, se habló brevemente sobre la materia de Técnicas de IA y su relación con los temas que ya habíamos visto anteriormente en Fundamentos de IA.</w:t>
+      </w:r>
+    </w:p>
+    <w:p>
+      <w:pPr>
+        <w:rPr>
+          <w:sz w:val="24"/>
+          <w:szCs w:val="24"/>
+        </w:rPr>
+      </w:pPr>
+    </w:p>
+    <w:p>
+      <w:pPr>
+        <w:rPr>
+          <w:b/>
+          <w:color w:val="1F4E79" w:themeColor="accent1" w:themeShade="80"/>
+          <w:sz w:val="24"/>
+          <w:szCs w:val="24"/>
+        </w:rPr>
+      </w:pPr>
+      <w:r>
+        <w:rPr>
+          <w:b/>
+          <w:color w:val="1F4E79" w:themeColor="accent1" w:themeShade="80"/>
+          <w:sz w:val="24"/>
+          <w:szCs w:val="24"/>
+        </w:rPr>
+        <w:t xml:space="preserve">Clase 2: </w:t>
+      </w:r>
+      <w:proofErr w:type="spellStart"/>
+      <w:r>
+        <w:rPr>
+          <w:b/>
+          <w:color w:val="1F4E79" w:themeColor="accent1" w:themeShade="80"/>
+          <w:sz w:val="24"/>
+          <w:szCs w:val="24"/>
+        </w:rPr>
+        <w:t>Perceptrón</w:t>
+      </w:r>
+      <w:proofErr w:type="spellEnd"/>
+    </w:p>
+    <w:p>
+      <w:pPr>
+        <w:rPr>
+          <w:sz w:val="24"/>
+          <w:szCs w:val="24"/>
+        </w:rPr>
+      </w:pPr>
+      <w:r>
+        <w:rPr>
+          <w:sz w:val="24"/>
+          <w:szCs w:val="24"/>
+        </w:rPr>
+        <w:t xml:space="preserve">En la </w:t>
+      </w:r>
+      <w:r>
+        <w:rPr>
+          <w:sz w:val="24"/>
+          <w:szCs w:val="24"/>
+        </w:rPr>
+        <w:t xml:space="preserve">segunda clase vimos qué es un </w:t>
+      </w:r>
+      <w:proofErr w:type="spellStart"/>
+      <w:r>
+        <w:rPr>
+          <w:sz w:val="24"/>
+          <w:szCs w:val="24"/>
+        </w:rPr>
+        <w:t>perceptrón</w:t>
+      </w:r>
+      <w:proofErr w:type="spellEnd"/>
+      <w:r>
+        <w:rPr>
+          <w:sz w:val="24"/>
+          <w:szCs w:val="24"/>
+        </w:rPr>
+        <w:t xml:space="preserve">, que </w:t>
+      </w:r>
+      <w:r>
+        <w:rPr>
+          <w:sz w:val="24"/>
+          <w:szCs w:val="24"/>
+        </w:rPr>
+        <w:t xml:space="preserve">básicamente </w:t>
+      </w:r>
+      <w:r>
+        <w:rPr>
+          <w:sz w:val="24"/>
+          <w:szCs w:val="24"/>
+        </w:rPr>
+        <w:t>es un modelo sencillo de una neurona artificial que recibe entradas, l</w:t>
+      </w:r>
+      <w:r>
+        <w:rPr>
+          <w:sz w:val="24"/>
+          <w:szCs w:val="24"/>
+        </w:rPr>
+        <w:t xml:space="preserve">as procesa y genera una salida. También vimos su </w:t>
+      </w:r>
+      <w:r>
+        <w:rPr>
+          <w:sz w:val="24"/>
+          <w:szCs w:val="24"/>
+        </w:rPr>
+        <w:t>re</w:t>
+      </w:r>
+      <w:r>
+        <w:rPr>
+          <w:sz w:val="24"/>
+          <w:szCs w:val="24"/>
+        </w:rPr>
+        <w:t>presentación mediante un grafo</w:t>
+      </w:r>
+      <w:r>
+        <w:rPr>
+          <w:sz w:val="24"/>
+          <w:szCs w:val="24"/>
+        </w:rPr>
+        <w:t xml:space="preserve">, donde </w:t>
+      </w:r>
+      <w:r>
+        <w:rPr>
+          <w:sz w:val="24"/>
+          <w:szCs w:val="24"/>
+        </w:rPr>
+        <w:t>pudimos</w:t>
+      </w:r>
+      <w:r>
+        <w:rPr>
+          <w:sz w:val="24"/>
+          <w:szCs w:val="24"/>
+        </w:rPr>
+        <w:t xml:space="preserve"> observar las entradas, los pesos y la salida</w:t>
+      </w:r>
+      <w:r>
+        <w:rPr>
+          <w:sz w:val="24"/>
+          <w:szCs w:val="24"/>
+        </w:rPr>
+        <w:t>. Finalmente, el profe realizó una i</w:t>
+      </w:r>
+      <w:r>
+        <w:rPr>
+          <w:sz w:val="24"/>
+          <w:szCs w:val="24"/>
+        </w:rPr>
+        <w:t>mplement</w:t>
+      </w:r>
+      <w:r>
+        <w:rPr>
+          <w:sz w:val="24"/>
+          <w:szCs w:val="24"/>
+        </w:rPr>
+        <w:t xml:space="preserve">ación básica de un </w:t>
+      </w:r>
+      <w:proofErr w:type="spellStart"/>
+      <w:r>
+        <w:rPr>
+          <w:sz w:val="24"/>
+          <w:szCs w:val="24"/>
+        </w:rPr>
+        <w:t>perceptrón</w:t>
+      </w:r>
+      <w:proofErr w:type="spellEnd"/>
+      <w:r>
+        <w:rPr>
+          <w:sz w:val="24"/>
+          <w:szCs w:val="24"/>
+        </w:rPr>
+        <w:t xml:space="preserve"> </w:t>
+      </w:r>
+      <w:r>
+        <w:rPr>
+          <w:sz w:val="24"/>
+          <w:szCs w:val="24"/>
+        </w:rPr>
+        <w:t>para comprender mejor cómo funciona y cómo procesa los datos para obtener un resultado.</w:t>
+      </w:r>
+      <w:r>
+        <w:rPr>
+          <w:sz w:val="24"/>
+          <w:szCs w:val="24"/>
+        </w:rPr>
+        <w:t xml:space="preserve"> </w:t>
+      </w:r>
+    </w:p>
+    <w:p>
+      <w:pPr>
+        <w:rPr>
+          <w:sz w:val="24"/>
+          <w:szCs w:val="24"/>
+        </w:rPr>
+      </w:pPr>
+    </w:p>
+    <w:p>
+      <w:pPr>
+        <w:rPr>
+          <w:color w:val="1F4E79" w:themeColor="accent1" w:themeShade="80"/>
+          <w:sz w:val="24"/>
+          <w:szCs w:val="24"/>
+        </w:rPr>
+      </w:pPr>
+      <w:r>
+        <w:rPr>
+          <w:b/>
+          <w:bCs/>
+          <w:color w:val="1F4E79" w:themeColor="accent1" w:themeShade="80"/>
+          <w:sz w:val="24"/>
+          <w:szCs w:val="24"/>
+        </w:rPr>
+        <w:t>Clase 3: Función objetivo</w:t>
+      </w:r>
+    </w:p>
+    <w:p>
+      <w:pPr>
+        <w:rPr>
+          <w:sz w:val="24"/>
+          <w:szCs w:val="24"/>
+        </w:rPr>
+      </w:pPr>
+      <w:r>
+        <w:rPr>
+          <w:sz w:val="24"/>
+          <w:szCs w:val="24"/>
+        </w:rPr>
+        <w:t xml:space="preserve">En la tercera clase vimos qué es una </w:t>
+      </w:r>
+      <w:r>
+        <w:rPr>
+          <w:bCs/>
+          <w:sz w:val="24"/>
+          <w:szCs w:val="24"/>
+        </w:rPr>
+        <w:t>función objetivo</w:t>
+      </w:r>
+      <w:r>
+        <w:rPr>
+          <w:sz w:val="24"/>
+          <w:szCs w:val="24"/>
+        </w:rPr>
+        <w:t xml:space="preserve">, para qué sirve y cómo se puede representar y resolver en 3D. También conocimos la </w:t>
+      </w:r>
+      <w:proofErr w:type="spellStart"/>
+      <w:r>
+        <w:rPr>
+          <w:bCs/>
+          <w:sz w:val="24"/>
+          <w:szCs w:val="24"/>
+        </w:rPr>
+        <w:t>Ackley</w:t>
+      </w:r>
+      <w:proofErr w:type="spellEnd"/>
+      <w:r>
+        <w:rPr>
+          <w:bCs/>
+          <w:sz w:val="24"/>
+          <w:szCs w:val="24"/>
+        </w:rPr>
+        <w:t xml:space="preserve"> </w:t>
+      </w:r>
+      <w:proofErr w:type="spellStart"/>
+      <w:r>
+        <w:rPr>
+          <w:bCs/>
+          <w:sz w:val="24"/>
+          <w:szCs w:val="24"/>
+        </w:rPr>
+        <w:t>Function</w:t>
+      </w:r>
+      <w:proofErr w:type="spellEnd"/>
+      <w:r>
+        <w:rPr>
+          <w:sz w:val="24"/>
+          <w:szCs w:val="24"/>
+        </w:rPr>
+        <w:t xml:space="preserve">, una función utilizada para probar algoritmos de optimización. Como tarea, el profesor nos dejó realizar la implementación de la función de </w:t>
+      </w:r>
+      <w:proofErr w:type="spellStart"/>
+      <w:r>
+        <w:rPr>
+          <w:sz w:val="24"/>
+          <w:szCs w:val="24"/>
+        </w:rPr>
+        <w:t>Ackley</w:t>
+      </w:r>
+      <w:proofErr w:type="spellEnd"/>
+      <w:r>
+        <w:rPr>
+          <w:sz w:val="24"/>
+          <w:szCs w:val="24"/>
+        </w:rPr>
+        <w:t>.</w:t>
+      </w:r>
+    </w:p>
+    <w:p>
+      <w:pPr>
+        <w:rPr>
+          <w:sz w:val="24"/>
+          <w:szCs w:val="24"/>
+        </w:rPr>
+      </w:pPr>
       <w:bookmarkStart w:id="0" w:name="_GoBack"/>
       <w:bookmarkEnd w:id="0"/>
-      <w:proofErr w:type="spellStart"/>
-      <w:r>
-        <w:rPr>
-          <w:sz w:val="24"/>
-          <w:szCs w:val="24"/>
-        </w:rPr>
-        <w:t>También</w:t>
-      </w:r>
-      <w:proofErr w:type="spellEnd"/>
-      <w:r>
-        <w:rPr>
-          <w:sz w:val="24"/>
-          <w:szCs w:val="24"/>
-        </w:rPr>
-        <w:t xml:space="preserve"> durante la clase, el profesor hizo una dinámica de ofrecerles 7 y 8 en todo el semestre con la condición de no presentarse a su clase. Por esto, algunos compañeros decidieron retirarse al no querer comprometerse con el trabajo del semestre. Debido a esto, mis compañeros le pusieron como nombre a la clase “Selección natural”.</w:t>
-      </w:r>
-      <w:r>
-        <w:rPr>
-          <w:sz w:val="24"/>
-          <w:szCs w:val="24"/>
-        </w:rPr>
-        <w:t xml:space="preserve"> </w:t>
-      </w:r>
-      <w:r>
-        <w:rPr>
-          <w:sz w:val="24"/>
-          <w:szCs w:val="24"/>
-        </w:rPr>
-        <w:t>Finalmente, se habló brevemente sobre la materia de Técnicas de IA y su relación con los temas que ya habíamos visto anteriormente en Fundamentos de IA.</w:t>
-      </w:r>
-    </w:p>
-    <w:p>
-      <w:pPr>
-        <w:rPr>
-          <w:sz w:val="24"/>
-          <w:szCs w:val="24"/>
-        </w:rPr>
-      </w:pPr>
     </w:p>
     <w:sectPr>
       <w:pgSz w:w="12240" w:h="15840"/>

</xml_diff>